<commit_message>
Knowledge - 2-Science - 1/31/2026 - part 2
</commit_message>
<xml_diff>
--- a/Knowledge/2-Science/3-Social science/1-Linguistics/0-Intro to Linguistics/5-My Source/2-Linguistics Basics/21-Types of Grammatical Functions/6-Types of Modifiers/1-Types of Modifiers.docx
+++ b/Knowledge/2-Science/3-Social science/1-Linguistics/0-Intro to Linguistics/5-My Source/2-Linguistics Basics/21-Types of Grammatical Functions/6-Types of Modifiers/1-Types of Modifiers.docx
@@ -24,41 +24,60 @@
       </w:pPr>
       <w:r>
         <w:rPr>
+          <w:rFonts w:ascii="Arial" w:eastAsia="Arial" w:hAnsi="Arial" w:cs="Arial"/>
           <w:b/>
-          <w:shd w:val="clear" w:color="auto" w:fill="B7B7B7"/>
+          <w:color w:val="000000"/>
+          <w:sz w:val="18"/>
+          <w:highlight w:val="lightGray"/>
         </w:rPr>
-        <w:t># Source</w:t>
+        <w:t># Source: AI Source: Provided by: [Data Path</w:t>
       </w:r>
       <w:r>
         <w:rPr>
-          <w:shd w:val="clear" w:color="auto" w:fill="B7B7B7"/>
+          <w:rFonts w:ascii="Arial" w:eastAsia="Arial" w:hAnsi="Arial" w:cs="Arial"/>
+          <w:color w:val="000000"/>
+          <w:sz w:val="18"/>
+          <w:highlight w:val="lightGray"/>
         </w:rPr>
-        <w:t xml:space="preserve">: </w:t>
-      </w:r>
-      <w:proofErr w:type="spellStart"/>
-      <w:r>
-        <w:rPr>
-          <w:b/>
-          <w:shd w:val="clear" w:color="auto" w:fill="B7B7B7"/>
-        </w:rPr>
-        <w:t>Chatgpt</w:t>
-      </w:r>
-      <w:proofErr w:type="spellEnd"/>
-      <w:r>
-        <w:rPr>
-          <w:b/>
-          <w:shd w:val="clear" w:color="auto" w:fill="B7B7B7"/>
-        </w:rPr>
-        <w:t xml:space="preserve"> </w:t>
+        <w:t xml:space="preserve">: Persons Table -&gt; ID Column: 1, Name_En Column: Motasem Essam] -&gt; </w:t>
       </w:r>
       <w:r>
         <w:rPr>
+          <w:rFonts w:ascii="Arial" w:eastAsia="Arial" w:hAnsi="Arial" w:cs="Arial"/>
           <w:b/>
-          <w:sz w:val="14"/>
-          <w:szCs w:val="14"/>
-          <w:shd w:val="clear" w:color="auto" w:fill="B7B7B7"/>
+          <w:color w:val="000000"/>
+          <w:sz w:val="18"/>
+          <w:highlight w:val="lightGray"/>
         </w:rPr>
-        <w:t>(GPT-4-turbo) at [8/6/2025]</w:t>
+        <w:t>From:</w:t>
+      </w:r>
+      <w:r>
+        <w:rPr>
+          <w:rFonts w:ascii="Arial" w:eastAsia="Arial" w:hAnsi="Arial" w:cs="Arial"/>
+          <w:color w:val="000000"/>
+          <w:sz w:val="18"/>
+          <w:highlight w:val="lightGray"/>
+        </w:rPr>
+        <w:t xml:space="preserve"> [Chatgpt (GPT-4-turbo)] </w:t>
+      </w:r>
+      <w:r>
+        <w:rPr>
+          <w:rFonts w:ascii="Arial" w:eastAsia="Arial" w:hAnsi="Arial" w:cs="Arial"/>
+          <w:b/>
+          <w:color w:val="000000"/>
+          <w:sz w:val="18"/>
+          <w:highlight w:val="lightGray"/>
+        </w:rPr>
+        <w:t>on</w:t>
+      </w:r>
+      <w:r>
+        <w:rPr>
+          <w:rFonts w:ascii="Arial" w:eastAsia="Arial" w:hAnsi="Arial"/>
+          <w:b/>
+          <w:sz w:val="18"/>
+          <w:highlight w:val="lightGray"/>
+        </w:rPr>
+        <w:t xml:space="preserve"> [8/6/2025]</w:t>
       </w:r>
     </w:p>
     <w:p>
@@ -67,7 +86,7 @@
           <w:noProof/>
         </w:rPr>
         <w:drawing>
-          <wp:inline distT="114300" distB="114300" distL="114300" distR="114300" wp14:anchorId="4BC3F44C" wp14:editId="377FF5D4">
+          <wp:inline distT="114300" distB="114300" distL="114300" distR="114300" wp14:anchorId="587C47F3" wp14:editId="32E11D94">
             <wp:extent cx="5943600" cy="5054600"/>
             <wp:effectExtent l="0" t="0" r="0" b="0"/>
             <wp:docPr id="1" name="image1.png"/>
@@ -467,7 +486,6 @@
                 <w:rFonts w:ascii="Roboto Mono" w:eastAsia="Roboto Mono" w:hAnsi="Roboto Mono" w:cs="Roboto Mono"/>
                 <w:b/>
               </w:rPr>
-              <w:lastRenderedPageBreak/>
               <w:t>Prepositional Phrase</w:t>
             </w:r>
           </w:p>
@@ -1785,11 +1803,12 @@
     </w:tbl>
     <w:p/>
     <w:p/>
+    <w:p/>
     <w:sectPr>
       <w:pgSz w:w="12240" w:h="15840"/>
       <w:pgMar w:top="1440" w:right="1440" w:bottom="1440" w:left="1440" w:header="720" w:footer="720" w:gutter="0"/>
-      <w:pgNumType w:start="1"/>
       <w:cols w:space="720"/>
+      <w:docGrid w:linePitch="360"/>
     </w:sectPr>
   </w:body>
 </w:document>
@@ -2195,18 +2214,6 @@
   <w:style w:type="paragraph" w:default="1" w:styleId="Normal">
     <w:name w:val="Normal"/>
     <w:qFormat/>
-    <w:rsid w:val="003C6CA9"/>
-    <w:pPr>
-      <w:spacing w:after="0" w:line="276" w:lineRule="auto"/>
-    </w:pPr>
-    <w:rPr>
-      <w:rFonts w:ascii="Arial" w:eastAsia="Arial" w:hAnsi="Arial" w:cs="Arial"/>
-      <w:kern w:val="0"/>
-      <w:sz w:val="22"/>
-      <w:szCs w:val="22"/>
-      <w:lang w:val="en"/>
-      <w14:ligatures w14:val="none"/>
-    </w:rPr>
   </w:style>
   <w:style w:type="paragraph" w:styleId="Heading1">
     <w:name w:val="heading 1"/>
@@ -2215,21 +2222,18 @@
     <w:link w:val="Heading1Char"/>
     <w:uiPriority w:val="9"/>
     <w:qFormat/>
-    <w:rsid w:val="002E193A"/>
+    <w:rsid w:val="00AF5445"/>
     <w:pPr>
       <w:keepNext/>
       <w:keepLines/>
-      <w:spacing w:before="360" w:after="80" w:line="278" w:lineRule="auto"/>
+      <w:spacing w:before="360" w:after="80"/>
       <w:outlineLvl w:val="0"/>
     </w:pPr>
     <w:rPr>
       <w:rFonts w:asciiTheme="majorHAnsi" w:eastAsiaTheme="majorEastAsia" w:hAnsiTheme="majorHAnsi" w:cstheme="majorBidi"/>
       <w:color w:val="2F5496" w:themeColor="accent1" w:themeShade="BF"/>
-      <w:kern w:val="2"/>
       <w:sz w:val="40"/>
       <w:szCs w:val="40"/>
-      <w:lang w:val="en-US"/>
-      <w14:ligatures w14:val="standardContextual"/>
     </w:rPr>
   </w:style>
   <w:style w:type="paragraph" w:styleId="Heading2">
@@ -2241,21 +2245,18 @@
     <w:semiHidden/>
     <w:unhideWhenUsed/>
     <w:qFormat/>
-    <w:rsid w:val="002E193A"/>
+    <w:rsid w:val="00AF5445"/>
     <w:pPr>
       <w:keepNext/>
       <w:keepLines/>
-      <w:spacing w:before="160" w:after="80" w:line="278" w:lineRule="auto"/>
+      <w:spacing w:before="160" w:after="80"/>
       <w:outlineLvl w:val="1"/>
     </w:pPr>
     <w:rPr>
       <w:rFonts w:asciiTheme="majorHAnsi" w:eastAsiaTheme="majorEastAsia" w:hAnsiTheme="majorHAnsi" w:cstheme="majorBidi"/>
       <w:color w:val="2F5496" w:themeColor="accent1" w:themeShade="BF"/>
-      <w:kern w:val="2"/>
       <w:sz w:val="32"/>
       <w:szCs w:val="32"/>
-      <w:lang w:val="en-US"/>
-      <w14:ligatures w14:val="standardContextual"/>
     </w:rPr>
   </w:style>
   <w:style w:type="paragraph" w:styleId="Heading3">
@@ -2267,21 +2268,18 @@
     <w:semiHidden/>
     <w:unhideWhenUsed/>
     <w:qFormat/>
-    <w:rsid w:val="002E193A"/>
+    <w:rsid w:val="00AF5445"/>
     <w:pPr>
       <w:keepNext/>
       <w:keepLines/>
-      <w:spacing w:before="160" w:after="80" w:line="278" w:lineRule="auto"/>
+      <w:spacing w:before="160" w:after="80"/>
       <w:outlineLvl w:val="2"/>
     </w:pPr>
     <w:rPr>
-      <w:rFonts w:asciiTheme="minorHAnsi" w:eastAsiaTheme="majorEastAsia" w:hAnsiTheme="minorHAnsi" w:cstheme="majorBidi"/>
+      <w:rFonts w:eastAsiaTheme="majorEastAsia" w:cstheme="majorBidi"/>
       <w:color w:val="2F5496" w:themeColor="accent1" w:themeShade="BF"/>
-      <w:kern w:val="2"/>
       <w:sz w:val="28"/>
       <w:szCs w:val="28"/>
-      <w:lang w:val="en-US"/>
-      <w14:ligatures w14:val="standardContextual"/>
     </w:rPr>
   </w:style>
   <w:style w:type="paragraph" w:styleId="Heading4">
@@ -2293,23 +2291,18 @@
     <w:semiHidden/>
     <w:unhideWhenUsed/>
     <w:qFormat/>
-    <w:rsid w:val="002E193A"/>
+    <w:rsid w:val="00AF5445"/>
     <w:pPr>
       <w:keepNext/>
       <w:keepLines/>
-      <w:spacing w:before="80" w:after="40" w:line="278" w:lineRule="auto"/>
+      <w:spacing w:before="80" w:after="40"/>
       <w:outlineLvl w:val="3"/>
     </w:pPr>
     <w:rPr>
-      <w:rFonts w:asciiTheme="minorHAnsi" w:eastAsiaTheme="majorEastAsia" w:hAnsiTheme="minorHAnsi" w:cstheme="majorBidi"/>
+      <w:rFonts w:eastAsiaTheme="majorEastAsia" w:cstheme="majorBidi"/>
       <w:i/>
       <w:iCs/>
       <w:color w:val="2F5496" w:themeColor="accent1" w:themeShade="BF"/>
-      <w:kern w:val="2"/>
-      <w:sz w:val="24"/>
-      <w:szCs w:val="24"/>
-      <w:lang w:val="en-US"/>
-      <w14:ligatures w14:val="standardContextual"/>
     </w:rPr>
   </w:style>
   <w:style w:type="paragraph" w:styleId="Heading5">
@@ -2321,21 +2314,16 @@
     <w:semiHidden/>
     <w:unhideWhenUsed/>
     <w:qFormat/>
-    <w:rsid w:val="002E193A"/>
+    <w:rsid w:val="00AF5445"/>
     <w:pPr>
       <w:keepNext/>
       <w:keepLines/>
-      <w:spacing w:before="80" w:after="40" w:line="278" w:lineRule="auto"/>
+      <w:spacing w:before="80" w:after="40"/>
       <w:outlineLvl w:val="4"/>
     </w:pPr>
     <w:rPr>
-      <w:rFonts w:asciiTheme="minorHAnsi" w:eastAsiaTheme="majorEastAsia" w:hAnsiTheme="minorHAnsi" w:cstheme="majorBidi"/>
+      <w:rFonts w:eastAsiaTheme="majorEastAsia" w:cstheme="majorBidi"/>
       <w:color w:val="2F5496" w:themeColor="accent1" w:themeShade="BF"/>
-      <w:kern w:val="2"/>
-      <w:sz w:val="24"/>
-      <w:szCs w:val="24"/>
-      <w:lang w:val="en-US"/>
-      <w14:ligatures w14:val="standardContextual"/>
     </w:rPr>
   </w:style>
   <w:style w:type="paragraph" w:styleId="Heading6">
@@ -2347,23 +2335,18 @@
     <w:semiHidden/>
     <w:unhideWhenUsed/>
     <w:qFormat/>
-    <w:rsid w:val="002E193A"/>
+    <w:rsid w:val="00AF5445"/>
     <w:pPr>
       <w:keepNext/>
       <w:keepLines/>
-      <w:spacing w:before="40" w:line="278" w:lineRule="auto"/>
+      <w:spacing w:before="40" w:after="0"/>
       <w:outlineLvl w:val="5"/>
     </w:pPr>
     <w:rPr>
-      <w:rFonts w:asciiTheme="minorHAnsi" w:eastAsiaTheme="majorEastAsia" w:hAnsiTheme="minorHAnsi" w:cstheme="majorBidi"/>
+      <w:rFonts w:eastAsiaTheme="majorEastAsia" w:cstheme="majorBidi"/>
       <w:i/>
       <w:iCs/>
       <w:color w:val="595959" w:themeColor="text1" w:themeTint="A6"/>
-      <w:kern w:val="2"/>
-      <w:sz w:val="24"/>
-      <w:szCs w:val="24"/>
-      <w:lang w:val="en-US"/>
-      <w14:ligatures w14:val="standardContextual"/>
     </w:rPr>
   </w:style>
   <w:style w:type="paragraph" w:styleId="Heading7">
@@ -2375,21 +2358,16 @@
     <w:semiHidden/>
     <w:unhideWhenUsed/>
     <w:qFormat/>
-    <w:rsid w:val="002E193A"/>
+    <w:rsid w:val="00AF5445"/>
     <w:pPr>
       <w:keepNext/>
       <w:keepLines/>
-      <w:spacing w:before="40" w:line="278" w:lineRule="auto"/>
+      <w:spacing w:before="40" w:after="0"/>
       <w:outlineLvl w:val="6"/>
     </w:pPr>
     <w:rPr>
-      <w:rFonts w:asciiTheme="minorHAnsi" w:eastAsiaTheme="majorEastAsia" w:hAnsiTheme="minorHAnsi" w:cstheme="majorBidi"/>
+      <w:rFonts w:eastAsiaTheme="majorEastAsia" w:cstheme="majorBidi"/>
       <w:color w:val="595959" w:themeColor="text1" w:themeTint="A6"/>
-      <w:kern w:val="2"/>
-      <w:sz w:val="24"/>
-      <w:szCs w:val="24"/>
-      <w:lang w:val="en-US"/>
-      <w14:ligatures w14:val="standardContextual"/>
     </w:rPr>
   </w:style>
   <w:style w:type="paragraph" w:styleId="Heading8">
@@ -2401,23 +2379,18 @@
     <w:semiHidden/>
     <w:unhideWhenUsed/>
     <w:qFormat/>
-    <w:rsid w:val="002E193A"/>
+    <w:rsid w:val="00AF5445"/>
     <w:pPr>
       <w:keepNext/>
       <w:keepLines/>
-      <w:spacing w:line="278" w:lineRule="auto"/>
+      <w:spacing w:after="0"/>
       <w:outlineLvl w:val="7"/>
     </w:pPr>
     <w:rPr>
-      <w:rFonts w:asciiTheme="minorHAnsi" w:eastAsiaTheme="majorEastAsia" w:hAnsiTheme="minorHAnsi" w:cstheme="majorBidi"/>
+      <w:rFonts w:eastAsiaTheme="majorEastAsia" w:cstheme="majorBidi"/>
       <w:i/>
       <w:iCs/>
       <w:color w:val="272727" w:themeColor="text1" w:themeTint="D8"/>
-      <w:kern w:val="2"/>
-      <w:sz w:val="24"/>
-      <w:szCs w:val="24"/>
-      <w:lang w:val="en-US"/>
-      <w14:ligatures w14:val="standardContextual"/>
     </w:rPr>
   </w:style>
   <w:style w:type="paragraph" w:styleId="Heading9">
@@ -2429,21 +2402,16 @@
     <w:semiHidden/>
     <w:unhideWhenUsed/>
     <w:qFormat/>
-    <w:rsid w:val="002E193A"/>
+    <w:rsid w:val="00AF5445"/>
     <w:pPr>
       <w:keepNext/>
       <w:keepLines/>
-      <w:spacing w:line="278" w:lineRule="auto"/>
+      <w:spacing w:after="0"/>
       <w:outlineLvl w:val="8"/>
     </w:pPr>
     <w:rPr>
-      <w:rFonts w:asciiTheme="minorHAnsi" w:eastAsiaTheme="majorEastAsia" w:hAnsiTheme="minorHAnsi" w:cstheme="majorBidi"/>
+      <w:rFonts w:eastAsiaTheme="majorEastAsia" w:cstheme="majorBidi"/>
       <w:color w:val="272727" w:themeColor="text1" w:themeTint="D8"/>
-      <w:kern w:val="2"/>
-      <w:sz w:val="24"/>
-      <w:szCs w:val="24"/>
-      <w:lang w:val="en-US"/>
-      <w14:ligatures w14:val="standardContextual"/>
     </w:rPr>
   </w:style>
   <w:style w:type="character" w:default="1" w:styleId="DefaultParagraphFont">
@@ -2478,7 +2446,7 @@
     <w:basedOn w:val="DefaultParagraphFont"/>
     <w:link w:val="Heading1"/>
     <w:uiPriority w:val="9"/>
-    <w:rsid w:val="002E193A"/>
+    <w:rsid w:val="00AF5445"/>
     <w:rPr>
       <w:rFonts w:asciiTheme="majorHAnsi" w:eastAsiaTheme="majorEastAsia" w:hAnsiTheme="majorHAnsi" w:cstheme="majorBidi"/>
       <w:color w:val="2F5496" w:themeColor="accent1" w:themeShade="BF"/>
@@ -2492,7 +2460,7 @@
     <w:link w:val="Heading2"/>
     <w:uiPriority w:val="9"/>
     <w:semiHidden/>
-    <w:rsid w:val="002E193A"/>
+    <w:rsid w:val="00AF5445"/>
     <w:rPr>
       <w:rFonts w:asciiTheme="majorHAnsi" w:eastAsiaTheme="majorEastAsia" w:hAnsiTheme="majorHAnsi" w:cstheme="majorBidi"/>
       <w:color w:val="2F5496" w:themeColor="accent1" w:themeShade="BF"/>
@@ -2506,7 +2474,7 @@
     <w:link w:val="Heading3"/>
     <w:uiPriority w:val="9"/>
     <w:semiHidden/>
-    <w:rsid w:val="002E193A"/>
+    <w:rsid w:val="00AF5445"/>
     <w:rPr>
       <w:rFonts w:eastAsiaTheme="majorEastAsia" w:cstheme="majorBidi"/>
       <w:color w:val="2F5496" w:themeColor="accent1" w:themeShade="BF"/>
@@ -2520,7 +2488,7 @@
     <w:link w:val="Heading4"/>
     <w:uiPriority w:val="9"/>
     <w:semiHidden/>
-    <w:rsid w:val="002E193A"/>
+    <w:rsid w:val="00AF5445"/>
     <w:rPr>
       <w:rFonts w:eastAsiaTheme="majorEastAsia" w:cstheme="majorBidi"/>
       <w:i/>
@@ -2534,7 +2502,7 @@
     <w:link w:val="Heading5"/>
     <w:uiPriority w:val="9"/>
     <w:semiHidden/>
-    <w:rsid w:val="002E193A"/>
+    <w:rsid w:val="00AF5445"/>
     <w:rPr>
       <w:rFonts w:eastAsiaTheme="majorEastAsia" w:cstheme="majorBidi"/>
       <w:color w:val="2F5496" w:themeColor="accent1" w:themeShade="BF"/>
@@ -2546,7 +2514,7 @@
     <w:link w:val="Heading6"/>
     <w:uiPriority w:val="9"/>
     <w:semiHidden/>
-    <w:rsid w:val="002E193A"/>
+    <w:rsid w:val="00AF5445"/>
     <w:rPr>
       <w:rFonts w:eastAsiaTheme="majorEastAsia" w:cstheme="majorBidi"/>
       <w:i/>
@@ -2560,7 +2528,7 @@
     <w:link w:val="Heading7"/>
     <w:uiPriority w:val="9"/>
     <w:semiHidden/>
-    <w:rsid w:val="002E193A"/>
+    <w:rsid w:val="00AF5445"/>
     <w:rPr>
       <w:rFonts w:eastAsiaTheme="majorEastAsia" w:cstheme="majorBidi"/>
       <w:color w:val="595959" w:themeColor="text1" w:themeTint="A6"/>
@@ -2572,7 +2540,7 @@
     <w:link w:val="Heading8"/>
     <w:uiPriority w:val="9"/>
     <w:semiHidden/>
-    <w:rsid w:val="002E193A"/>
+    <w:rsid w:val="00AF5445"/>
     <w:rPr>
       <w:rFonts w:eastAsiaTheme="majorEastAsia" w:cstheme="majorBidi"/>
       <w:i/>
@@ -2586,7 +2554,7 @@
     <w:link w:val="Heading9"/>
     <w:uiPriority w:val="9"/>
     <w:semiHidden/>
-    <w:rsid w:val="002E193A"/>
+    <w:rsid w:val="00AF5445"/>
     <w:rPr>
       <w:rFonts w:eastAsiaTheme="majorEastAsia" w:cstheme="majorBidi"/>
       <w:color w:val="272727" w:themeColor="text1" w:themeTint="D8"/>
@@ -2599,7 +2567,7 @@
     <w:link w:val="TitleChar"/>
     <w:uiPriority w:val="10"/>
     <w:qFormat/>
-    <w:rsid w:val="002E193A"/>
+    <w:rsid w:val="00AF5445"/>
     <w:pPr>
       <w:spacing w:after="80" w:line="240" w:lineRule="auto"/>
       <w:contextualSpacing/>
@@ -2610,8 +2578,6 @@
       <w:kern w:val="28"/>
       <w:sz w:val="56"/>
       <w:szCs w:val="56"/>
-      <w:lang w:val="en-US"/>
-      <w14:ligatures w14:val="standardContextual"/>
     </w:rPr>
   </w:style>
   <w:style w:type="character" w:customStyle="1" w:styleId="TitleChar">
@@ -2619,7 +2585,7 @@
     <w:basedOn w:val="DefaultParagraphFont"/>
     <w:link w:val="Title"/>
     <w:uiPriority w:val="10"/>
-    <w:rsid w:val="002E193A"/>
+    <w:rsid w:val="00AF5445"/>
     <w:rPr>
       <w:rFonts w:asciiTheme="majorHAnsi" w:eastAsiaTheme="majorEastAsia" w:hAnsiTheme="majorHAnsi" w:cstheme="majorBidi"/>
       <w:spacing w:val="-10"/>
@@ -2635,30 +2601,12 @@
     <w:link w:val="SubtitleChar"/>
     <w:uiPriority w:val="11"/>
     <w:qFormat/>
-    <w:rsid w:val="002E193A"/>
+    <w:rsid w:val="00AF5445"/>
     <w:pPr>
       <w:numPr>
         <w:ilvl w:val="1"/>
       </w:numPr>
-      <w:spacing w:after="160" w:line="278" w:lineRule="auto"/>
     </w:pPr>
-    <w:rPr>
-      <w:rFonts w:asciiTheme="minorHAnsi" w:eastAsiaTheme="majorEastAsia" w:hAnsiTheme="minorHAnsi" w:cstheme="majorBidi"/>
-      <w:color w:val="595959" w:themeColor="text1" w:themeTint="A6"/>
-      <w:spacing w:val="15"/>
-      <w:kern w:val="2"/>
-      <w:sz w:val="28"/>
-      <w:szCs w:val="28"/>
-      <w:lang w:val="en-US"/>
-      <w14:ligatures w14:val="standardContextual"/>
-    </w:rPr>
-  </w:style>
-  <w:style w:type="character" w:customStyle="1" w:styleId="SubtitleChar">
-    <w:name w:val="Subtitle Char"/>
-    <w:basedOn w:val="DefaultParagraphFont"/>
-    <w:link w:val="Subtitle"/>
-    <w:uiPriority w:val="11"/>
-    <w:rsid w:val="002E193A"/>
     <w:rPr>
       <w:rFonts w:eastAsiaTheme="majorEastAsia" w:cstheme="majorBidi"/>
       <w:color w:val="595959" w:themeColor="text1" w:themeTint="A6"/>
@@ -2667,6 +2615,20 @@
       <w:szCs w:val="28"/>
     </w:rPr>
   </w:style>
+  <w:style w:type="character" w:customStyle="1" w:styleId="SubtitleChar">
+    <w:name w:val="Subtitle Char"/>
+    <w:basedOn w:val="DefaultParagraphFont"/>
+    <w:link w:val="Subtitle"/>
+    <w:uiPriority w:val="11"/>
+    <w:rsid w:val="00AF5445"/>
+    <w:rPr>
+      <w:rFonts w:eastAsiaTheme="majorEastAsia" w:cstheme="majorBidi"/>
+      <w:color w:val="595959" w:themeColor="text1" w:themeTint="A6"/>
+      <w:spacing w:val="15"/>
+      <w:sz w:val="28"/>
+      <w:szCs w:val="28"/>
+    </w:rPr>
+  </w:style>
   <w:style w:type="paragraph" w:styleId="Quote">
     <w:name w:val="Quote"/>
     <w:basedOn w:val="Normal"/>
@@ -2674,21 +2636,15 @@
     <w:link w:val="QuoteChar"/>
     <w:uiPriority w:val="29"/>
     <w:qFormat/>
-    <w:rsid w:val="002E193A"/>
+    <w:rsid w:val="00AF5445"/>
     <w:pPr>
-      <w:spacing w:before="160" w:after="160" w:line="278" w:lineRule="auto"/>
+      <w:spacing w:before="160"/>
       <w:jc w:val="center"/>
     </w:pPr>
     <w:rPr>
-      <w:rFonts w:asciiTheme="minorHAnsi" w:eastAsiaTheme="minorHAnsi" w:hAnsiTheme="minorHAnsi" w:cstheme="minorBidi"/>
       <w:i/>
       <w:iCs/>
       <w:color w:val="404040" w:themeColor="text1" w:themeTint="BF"/>
-      <w:kern w:val="2"/>
-      <w:sz w:val="24"/>
-      <w:szCs w:val="24"/>
-      <w:lang w:val="en-US"/>
-      <w14:ligatures w14:val="standardContextual"/>
     </w:rPr>
   </w:style>
   <w:style w:type="character" w:customStyle="1" w:styleId="QuoteChar">
@@ -2696,7 +2652,7 @@
     <w:basedOn w:val="DefaultParagraphFont"/>
     <w:link w:val="Quote"/>
     <w:uiPriority w:val="29"/>
-    <w:rsid w:val="002E193A"/>
+    <w:rsid w:val="00AF5445"/>
     <w:rPr>
       <w:i/>
       <w:iCs/>
@@ -2708,27 +2664,18 @@
     <w:basedOn w:val="Normal"/>
     <w:uiPriority w:val="34"/>
     <w:qFormat/>
-    <w:rsid w:val="002E193A"/>
+    <w:rsid w:val="00AF5445"/>
     <w:pPr>
-      <w:spacing w:after="160" w:line="278" w:lineRule="auto"/>
       <w:ind w:left="720"/>
       <w:contextualSpacing/>
     </w:pPr>
-    <w:rPr>
-      <w:rFonts w:asciiTheme="minorHAnsi" w:eastAsiaTheme="minorHAnsi" w:hAnsiTheme="minorHAnsi" w:cstheme="minorBidi"/>
-      <w:kern w:val="2"/>
-      <w:sz w:val="24"/>
-      <w:szCs w:val="24"/>
-      <w:lang w:val="en-US"/>
-      <w14:ligatures w14:val="standardContextual"/>
-    </w:rPr>
   </w:style>
   <w:style w:type="character" w:styleId="IntenseEmphasis">
     <w:name w:val="Intense Emphasis"/>
     <w:basedOn w:val="DefaultParagraphFont"/>
     <w:uiPriority w:val="21"/>
     <w:qFormat/>
-    <w:rsid w:val="002E193A"/>
+    <w:rsid w:val="00AF5445"/>
     <w:rPr>
       <w:i/>
       <w:iCs/>
@@ -2742,26 +2689,20 @@
     <w:link w:val="IntenseQuoteChar"/>
     <w:uiPriority w:val="30"/>
     <w:qFormat/>
-    <w:rsid w:val="002E193A"/>
+    <w:rsid w:val="00AF5445"/>
     <w:pPr>
       <w:pBdr>
         <w:top w:val="single" w:sz="4" w:space="10" w:color="2F5496" w:themeColor="accent1" w:themeShade="BF"/>
         <w:bottom w:val="single" w:sz="4" w:space="10" w:color="2F5496" w:themeColor="accent1" w:themeShade="BF"/>
       </w:pBdr>
-      <w:spacing w:before="360" w:after="360" w:line="278" w:lineRule="auto"/>
+      <w:spacing w:before="360" w:after="360"/>
       <w:ind w:left="864" w:right="864"/>
       <w:jc w:val="center"/>
     </w:pPr>
     <w:rPr>
-      <w:rFonts w:asciiTheme="minorHAnsi" w:eastAsiaTheme="minorHAnsi" w:hAnsiTheme="minorHAnsi" w:cstheme="minorBidi"/>
       <w:i/>
       <w:iCs/>
       <w:color w:val="2F5496" w:themeColor="accent1" w:themeShade="BF"/>
-      <w:kern w:val="2"/>
-      <w:sz w:val="24"/>
-      <w:szCs w:val="24"/>
-      <w:lang w:val="en-US"/>
-      <w14:ligatures w14:val="standardContextual"/>
     </w:rPr>
   </w:style>
   <w:style w:type="character" w:customStyle="1" w:styleId="IntenseQuoteChar">
@@ -2769,7 +2710,7 @@
     <w:basedOn w:val="DefaultParagraphFont"/>
     <w:link w:val="IntenseQuote"/>
     <w:uiPriority w:val="30"/>
-    <w:rsid w:val="002E193A"/>
+    <w:rsid w:val="00AF5445"/>
     <w:rPr>
       <w:i/>
       <w:iCs/>
@@ -2781,7 +2722,7 @@
     <w:basedOn w:val="DefaultParagraphFont"/>
     <w:uiPriority w:val="32"/>
     <w:qFormat/>
-    <w:rsid w:val="002E193A"/>
+    <w:rsid w:val="00AF5445"/>
     <w:rPr>
       <w:b/>
       <w:bCs/>

</xml_diff>